<commit_message>
Update revisi v5: perbaikan BAB 1 urgensi, justifikasi variabel, transisi
</commit_message>
<xml_diff>
--- a/REVISI_PROPOSAL_AFLAH.docx
+++ b/REVISI_PROPOSAL_AFLAH.docx
@@ -8,7 +8,7 @@
         <w:jc w:val="center"/>
       </w:pPr>
       <w:r>
-        <w:t>PANDUAN REVISI PROPOSAL TUGAS AKHIR (v4 - Final)</w:t>
+        <w:t>PANDUAN REVISI PROPOSAL TUGAS AKHIR (v5 - Final)</w:t>
       </w:r>
     </w:p>
     <w:p>
@@ -35,7 +35,7 @@
         <w:jc w:val="center"/>
       </w:pPr>
       <w:r>
-        <w:t>Dokumen panduan revisi final (19 revisi). Mencakup perbaikan dari kritik reviewer, analisis dataset, perbaikan alur metodologi, constraint Permenkes+WHO, dan pencegahan duplikasi konten.</w:t>
+        <w:t>Dokumen panduan revisi final (22 revisi). Versi 5 menambahkan perbaikan BAB 1: urgensi dengan data Indonesia, justifikasi variabel actionable, dan transisi eksplisit ke rumusan masalah.</w:t>
       </w:r>
     </w:p>
     <w:p>
@@ -5818,6 +5818,214 @@
         <w:pStyle w:val="Heading2"/>
       </w:pPr>
       <w:r>
+        <w:t>REVISI 20: URGENSI DENGAN DATA INDONESIA</w:t>
+      </w:r>
+    </w:p>
+    <w:p>
+      <w:r>
+        <w:t>Lokasi: BAB 1, Paragraf PERTAMA Latar Belakang (halaman 1), SISIPKAN setelah kalimat pertama "Kualitas air minum yang memenuhi standar kelayakan merupakan aspek fundamental dalam menjaga kesehatan masyarakat sekaligus mendukung keberlanjutan ekosistem perairan."</w:t>
+      </w:r>
+    </w:p>
+    <w:p>
+      <w:r>
+        <w:t>Alasan: Urgensi terlalu abstrak dan akademis. Tidak ada data konkret yang menunjukkan masalah nyata.</w:t>
+      </w:r>
+    </w:p>
+    <w:p/>
+    <w:p>
+      <w:r>
+        <w:rPr>
+          <w:b/>
+        </w:rPr>
+        <w:t>KALIMAT YANG DISISIPKAN (tambahkan SETELAH kalimat pertama paragraf 1):</w:t>
+      </w:r>
+    </w:p>
+    <w:p>
+      <w:r>
+        <w:t>Menurut WHO (2022), sekitar 2 miliar orang di seluruh dunia masih menggunakan sumber air minum yang terkontaminasi. Di Indonesia, data Badan Pusat Statistik (2023) menunjukkan bahwa akses terhadap air minum layak belum merata di seluruh wilayah, dengan disparitas signifikan antara perkotaan dan perdesaan. Kondisi ini menegaskan kebutuhan akan sistem monitoring dan evaluasi kualitas air yang tidak hanya akurat dalam memprediksi kelayakan, tetapi juga mampu memberikan rekomendasi perbaikan yang spesifik dan dapat ditindaklanjuti oleh operator pengolahan air.</w:t>
+      </w:r>
+    </w:p>
+    <w:p/>
+    <w:p>
+      <w:r>
+        <w:rPr>
+          <w:b/>
+        </w:rPr>
+        <w:t>CATATAN PENTING:</w:t>
+      </w:r>
+      <w:r>
+        <w:t xml:space="preserve"> Verifikasi angka dan tahun dari sumber resmi:</w:t>
+      </w:r>
+    </w:p>
+    <w:p>
+      <w:r>
+        <w:t>- WHO: "Drinking-water Key Facts" (2022/2023) - https://www.who.int/news-room/fact-sheets/detail/drinking-water</w:t>
+      </w:r>
+    </w:p>
+    <w:p>
+      <w:r>
+        <w:t>- BPS: "Statistik Lingkungan Hidup Indonesia" atau "Indikator Perumahan dan Kesehatan Lingkungan" edisi terbaru</w:t>
+      </w:r>
+    </w:p>
+    <w:p>
+      <w:r>
+        <w:t>- Pastikan sitasi sesuai format IEEE yang digunakan di proposal</w:t>
+      </w:r>
+    </w:p>
+    <w:p>
+      <w:r>
+        <w:br w:type="page"/>
+      </w:r>
+    </w:p>
+    <w:p>
+      <w:pPr>
+        <w:pStyle w:val="Heading2"/>
+      </w:pPr>
+      <w:r>
+        <w:t>REVISI 21: JUSTIFIKASI VARIABEL FISIKOKIMIA (ACTIONABLE)</w:t>
+      </w:r>
+    </w:p>
+    <w:p>
+      <w:r>
+        <w:t>Lokasi: BAB 1, Paragraf ke-2 Latar Belakang (halaman 1), SISIPKAN setelah kalimat "Parameter-parameter tersebut saling memengaruhi secara kompleks, sehingga status kelayakan air tidak dapat ditentukan melalui pendekatan sederhana dan memerlukan analisis data yang lebih mendalam."</w:t>
+      </w:r>
+    </w:p>
+    <w:p>
+      <w:r>
+        <w:t>Alasan: Tidak ada justifikasi mengapa parameter fisikokimia dipilih. Dosen bisa bertanya "kenapa tidak parameter biologis?"</w:t>
+      </w:r>
+    </w:p>
+    <w:p/>
+    <w:p>
+      <w:r>
+        <w:rPr>
+          <w:b/>
+        </w:rPr>
+        <w:t>KALIMAT YANG DISISIPKAN:</w:t>
+      </w:r>
+    </w:p>
+    <w:p>
+      <w:r>
+        <w:t>Parameter fisikokimia dipilih sebagai fokus analisis karena bersifat controllable dan actionable, yaitu nilainya dapat diintervensi secara langsung melalui proses pengolahan air seperti koagulasi, filtrasi, aerasi, dan disinfeksi [1], [6]. Karakteristik ini menjadikan parameter fisikokimia sesuai dengan kebutuhan analisis preskriptif berbasis counterfactual, yang memerlukan fitur-fitur yang secara operasional dapat dimodifikasi untuk mencapai kondisi target yang diinginkan.</w:t>
+      </w:r>
+    </w:p>
+    <w:p/>
+    <w:p>
+      <w:r>
+        <w:rPr>
+          <w:b/>
+        </w:rPr>
+        <w:t>PENJELASAN:</w:t>
+      </w:r>
+      <w:r>
+        <w:t xml:space="preserve"> Kalimat ini memberikan justifikasi GANDA:</w:t>
+      </w:r>
+    </w:p>
+    <w:p>
+      <w:r>
+        <w:t>(1) Fisikokimia bersifat controllable (bisa diubah di lapangan)</w:t>
+      </w:r>
+    </w:p>
+    <w:p>
+      <w:r>
+        <w:t>(2) Counterfactual memerlukan fitur actionable (syarat metodologis)</w:t>
+      </w:r>
+    </w:p>
+    <w:p>
+      <w:r>
+        <w:t>Sehingga pilihan variabel BUKAN kebetulan dari dataset, tapi karena memang sesuai dengan kebutuhan metodologi penelitian.</w:t>
+      </w:r>
+    </w:p>
+    <w:p>
+      <w:r>
+        <w:br w:type="page"/>
+      </w:r>
+    </w:p>
+    <w:p>
+      <w:pPr>
+        <w:pStyle w:val="Heading2"/>
+      </w:pPr>
+      <w:r>
+        <w:t>REVISI 22: TRANSISI EKSPLISIT KE RUMUSAN MASALAH</w:t>
+      </w:r>
+    </w:p>
+    <w:p>
+      <w:r>
+        <w:t>Lokasi: BAB 1, Sub-bab 1.2 Rumusan Masalah (halaman 3), GANTI paragraf pengantar sebelum daftar rumusan masalah.</w:t>
+      </w:r>
+    </w:p>
+    <w:p>
+      <w:r>
+        <w:t>Alasan: Transisi dari latar belakang ke rumusan masalah kurang eksplisit. Derivasi RM dari gap tidak ditunjukkan secara jelas.</w:t>
+      </w:r>
+    </w:p>
+    <w:p/>
+    <w:p>
+      <w:r>
+        <w:rPr>
+          <w:b/>
+        </w:rPr>
+        <w:t>PARAGRAF LAMA:</w:t>
+      </w:r>
+    </w:p>
+    <w:p>
+      <w:r>
+        <w:t>"Berdasarkan latar belakang yang telah diuraikan, ketidakpastian pada data parameter fisikokimia, karakteristik black-box model prediktif, serta ketiadaan mekanisme rekomendasi preskriptif yang dapat ditindaklanjuti menjadi permasalahan utama dalam penelitian ini. Oleh karena itu, rumusan masalahnya adalah sebagai berikut:"</w:t>
+      </w:r>
+    </w:p>
+    <w:p/>
+    <w:p>
+      <w:r>
+        <w:rPr>
+          <w:b/>
+        </w:rPr>
+        <w:t>PARAGRAF BARU (GANTI):</w:t>
+      </w:r>
+    </w:p>
+    <w:p>
+      <w:r>
+        <w:t>"Berdasarkan latar belakang yang telah diuraikan, teridentifikasi tiga kesenjangan utama yang menjadi fokus penelitian ini: (1) ketiadaan estimasi ketidakpastian pada model machine learning deterministik yang digunakan di domain kualitas air, (2) ketiadaan mekanisme preskriptif yang mampu mentransformasi output prediksi menjadi rekomendasi tindakan operasional untuk perbaikan kualitas air, dan (3) belum adanya implementasi counterfactual explanations pada data fisikokimia air meskipun potensinya telah diidentifikasi dalam systematic review [7]. Berdasarkan tiga kesenjangan tersebut, dirumuskan pertanyaan penelitian sebagai berikut:"</w:t>
+      </w:r>
+    </w:p>
+    <w:p/>
+    <w:p>
+      <w:r>
+        <w:rPr>
+          <w:b/>
+        </w:rPr>
+        <w:t>PENJELASAN PERUBAHAN:</w:t>
+      </w:r>
+    </w:p>
+    <w:p>
+      <w:r>
+        <w:t>- Menghilangkan kata "black-box" (sesuai revisi sebelumnya)</w:t>
+      </w:r>
+    </w:p>
+    <w:p>
+      <w:r>
+        <w:t>- Menunjukkan 3 gap secara eksplisit dan terstruktur (numbered)</w:t>
+      </w:r>
+    </w:p>
+    <w:p>
+      <w:r>
+        <w:t>- Setiap gap langsung terhubung ke 1 rumusan masalah</w:t>
+      </w:r>
+    </w:p>
+    <w:p>
+      <w:r>
+        <w:t>- Menambahkan referensi [7] (Aderemi systematic review) sebagai backing</w:t>
+      </w:r>
+    </w:p>
+    <w:p>
+      <w:r>
+        <w:br w:type="page"/>
+      </w:r>
+    </w:p>
+    <w:p>
+      <w:pPr>
+        <w:pStyle w:val="Heading2"/>
+      </w:pPr>
+      <w:r>
         <w:t>STRATEGI SIDANG</w:t>
       </w:r>
     </w:p>
@@ -5914,6 +6122,29 @@
       </w:r>
     </w:p>
     <w:p>
+      <w:pPr>
+        <w:pStyle w:val="Heading3"/>
+      </w:pPr>
+      <w:r>
+        <w:t>Pertanyaan Variabel &amp; Topik</w:t>
+      </w:r>
+    </w:p>
+    <w:p>
+      <w:r>
+        <w:t>L1: "Parameter fisikokimia bersifat controllable/actionable - bisa diintervensi melalui proses pengolahan air."</w:t>
+      </w:r>
+    </w:p>
+    <w:p>
+      <w:r>
+        <w:t>L2: "Counterfactual explanations memerlukan fitur yang bisa diubah nilainya. Parameter biologis/mikroba tidak actionable karena bersifat outcome, bukan input yang bisa di-treat langsung."</w:t>
+      </w:r>
+    </w:p>
+    <w:p>
+      <w:r>
+        <w:t>L3: "Pemilihan topik berdasarkan gap yang eksplisit disebutkan di systematic review Aderemi et al. (2025) - belum ada implementasi CF di domain air."</w:t>
+      </w:r>
+    </w:p>
+    <w:p>
       <w:r>
         <w:br w:type="page"/>
       </w:r>
@@ -5923,7 +6154,7 @@
         <w:pStyle w:val="Heading2"/>
       </w:pPr>
       <w:r>
-        <w:t>CHECKLIST REVISI (19 Item)</w:t>
+        <w:t>CHECKLIST REVISI (22 Item)</w:t>
       </w:r>
     </w:p>
     <w:tbl>
@@ -7206,6 +7437,192 @@
           </w:p>
         </w:tc>
       </w:tr>
+      <w:tr>
+        <w:tc>
+          <w:tcPr>
+            <w:tcW w:type="dxa" w:w="1440"/>
+          </w:tcPr>
+          <w:p>
+            <w:r>
+              <w:t>20</w:t>
+            </w:r>
+          </w:p>
+        </w:tc>
+        <w:tc>
+          <w:tcPr>
+            <w:tcW w:type="dxa" w:w="1440"/>
+          </w:tcPr>
+          <w:p>
+            <w:r>
+              <w:t>Urgensi Indonesia</w:t>
+            </w:r>
+          </w:p>
+        </w:tc>
+        <w:tc>
+          <w:tcPr>
+            <w:tcW w:type="dxa" w:w="1440"/>
+          </w:tcPr>
+          <w:p>
+            <w:r>
+              <w:t>Hal.1 par.1</w:t>
+            </w:r>
+          </w:p>
+        </w:tc>
+        <w:tc>
+          <w:tcPr>
+            <w:tcW w:type="dxa" w:w="1440"/>
+          </w:tcPr>
+          <w:p>
+            <w:r>
+              <w:t>Sisipkan data WHO/BPS</w:t>
+            </w:r>
+          </w:p>
+        </w:tc>
+        <w:tc>
+          <w:tcPr>
+            <w:tcW w:type="dxa" w:w="1440"/>
+          </w:tcPr>
+          <w:p>
+            <w:r>
+              <w:t>SEDANG</w:t>
+            </w:r>
+          </w:p>
+        </w:tc>
+        <w:tc>
+          <w:tcPr>
+            <w:tcW w:type="dxa" w:w="1440"/>
+          </w:tcPr>
+          <w:p>
+            <w:r>
+              <w:t>[ ]</w:t>
+            </w:r>
+          </w:p>
+        </w:tc>
+      </w:tr>
+      <w:tr>
+        <w:tc>
+          <w:tcPr>
+            <w:tcW w:type="dxa" w:w="1440"/>
+          </w:tcPr>
+          <w:p>
+            <w:r>
+              <w:t>21</w:t>
+            </w:r>
+          </w:p>
+        </w:tc>
+        <w:tc>
+          <w:tcPr>
+            <w:tcW w:type="dxa" w:w="1440"/>
+          </w:tcPr>
+          <w:p>
+            <w:r>
+              <w:t>Justifikasi Variabel</w:t>
+            </w:r>
+          </w:p>
+        </w:tc>
+        <w:tc>
+          <w:tcPr>
+            <w:tcW w:type="dxa" w:w="1440"/>
+          </w:tcPr>
+          <w:p>
+            <w:r>
+              <w:t>Hal.1 par.2</w:t>
+            </w:r>
+          </w:p>
+        </w:tc>
+        <w:tc>
+          <w:tcPr>
+            <w:tcW w:type="dxa" w:w="1440"/>
+          </w:tcPr>
+          <w:p>
+            <w:r>
+              <w:t>Sisipkan 2 kalimat</w:t>
+            </w:r>
+          </w:p>
+        </w:tc>
+        <w:tc>
+          <w:tcPr>
+            <w:tcW w:type="dxa" w:w="1440"/>
+          </w:tcPr>
+          <w:p>
+            <w:r>
+              <w:t>SEDANG</w:t>
+            </w:r>
+          </w:p>
+        </w:tc>
+        <w:tc>
+          <w:tcPr>
+            <w:tcW w:type="dxa" w:w="1440"/>
+          </w:tcPr>
+          <w:p>
+            <w:r>
+              <w:t>[ ]</w:t>
+            </w:r>
+          </w:p>
+        </w:tc>
+      </w:tr>
+      <w:tr>
+        <w:tc>
+          <w:tcPr>
+            <w:tcW w:type="dxa" w:w="1440"/>
+          </w:tcPr>
+          <w:p>
+            <w:r>
+              <w:t>22</w:t>
+            </w:r>
+          </w:p>
+        </w:tc>
+        <w:tc>
+          <w:tcPr>
+            <w:tcW w:type="dxa" w:w="1440"/>
+          </w:tcPr>
+          <w:p>
+            <w:r>
+              <w:t>Transisi ke RM</w:t>
+            </w:r>
+          </w:p>
+        </w:tc>
+        <w:tc>
+          <w:tcPr>
+            <w:tcW w:type="dxa" w:w="1440"/>
+          </w:tcPr>
+          <w:p>
+            <w:r>
+              <w:t>Hal.3 sub.1.2</w:t>
+            </w:r>
+          </w:p>
+        </w:tc>
+        <w:tc>
+          <w:tcPr>
+            <w:tcW w:type="dxa" w:w="1440"/>
+          </w:tcPr>
+          <w:p>
+            <w:r>
+              <w:t>Ganti paragraf pengantar</w:t>
+            </w:r>
+          </w:p>
+        </w:tc>
+        <w:tc>
+          <w:tcPr>
+            <w:tcW w:type="dxa" w:w="1440"/>
+          </w:tcPr>
+          <w:p>
+            <w:r>
+              <w:t>SEDANG</w:t>
+            </w:r>
+          </w:p>
+        </w:tc>
+        <w:tc>
+          <w:tcPr>
+            <w:tcW w:type="dxa" w:w="1440"/>
+          </w:tcPr>
+          <w:p>
+            <w:r>
+              <w:t>[ ]</w:t>
+            </w:r>
+          </w:p>
+        </w:tc>
+      </w:tr>
     </w:tbl>
     <w:p/>
     <w:p>
@@ -7218,7 +7635,7 @@
         <w:pStyle w:val="Heading2"/>
       </w:pPr>
       <w:r>
-        <w:t>CATATAN PENTING (9 item)</w:t>
+        <w:t>CATATAN PENTING (11 item)</w:t>
       </w:r>
     </w:p>
     <w:p>
@@ -7264,6 +7681,16 @@
     <w:p>
       <w:r>
         <w:t>9. BAB 3 = PROSEDUR, BAB 2 = TEORI. Jangan duplikasi.</w:t>
+      </w:r>
+    </w:p>
+    <w:p>
+      <w:r>
+        <w:t>10. Data WHO dan BPS HARUS diverifikasi dari sumber resmi sebelum dimasukkan ke proposal</w:t>
+      </w:r>
+    </w:p>
+    <w:p>
+      <w:r>
+        <w:t>11. Manfaat penelitian TIDAK perlu ditambahkan sebagai sub-bab (tidak ada di template) - siapkan jawaban lisan saja</w:t>
       </w:r>
     </w:p>
     <w:sectPr>

</xml_diff>

<commit_message>
Update revisi v6: BAB 2 justifikasi metode, perbandingan XAI, gap analysis
</commit_message>
<xml_diff>
--- a/REVISI_PROPOSAL_AFLAH.docx
+++ b/REVISI_PROPOSAL_AFLAH.docx
@@ -8,7 +8,7 @@
         <w:jc w:val="center"/>
       </w:pPr>
       <w:r>
-        <w:t>PANDUAN REVISI PROPOSAL TUGAS AKHIR (v5 - Final)</w:t>
+        <w:t>PANDUAN REVISI PROPOSAL TUGAS AKHIR (v6 - Final)</w:t>
       </w:r>
     </w:p>
     <w:p>
@@ -35,7 +35,7 @@
         <w:jc w:val="center"/>
       </w:pPr>
       <w:r>
-        <w:t>Dokumen panduan revisi final (22 revisi). Versi 5 menambahkan perbaikan BAB 1: urgensi dengan data Indonesia, justifikasi variabel actionable, dan transisi eksplisit ke rumusan masalah.</w:t>
+        <w:t>Dokumen panduan revisi final (28 revisi). Versi 6 menambahkan perbaikan BAB 2: justifikasi metode NGBoost dan DiCE, tabel perbandingan XAI, batasan konsep probabilistik, what-if analysis, dan novelitas statement.</w:t>
       </w:r>
     </w:p>
     <w:p>
@@ -6026,6 +6026,525 @@
         <w:pStyle w:val="Heading2"/>
       </w:pPr>
       <w:r>
+        <w:t>REVISI 23: TABEL PERBANDINGAN XAI</w:t>
+      </w:r>
+    </w:p>
+    <w:p>
+      <w:r>
+        <w:t>Lokasi: Sub-bab 2.2.4 (sisipkan sebagai tabel perbandingan)</w:t>
+      </w:r>
+    </w:p>
+    <w:p>
+      <w:r>
+        <w:t>Alasan: Perlu justifikasi akademis mengapa DiCE dipilih dibandingkan metode XAI lain.</w:t>
+      </w:r>
+    </w:p>
+    <w:p/>
+    <w:p>
+      <w:r>
+        <w:rPr>
+          <w:b/>
+        </w:rPr>
+        <w:t>Tabel Perbandingan SHAP vs LIME vs Counterfactual (DiCE):</w:t>
+      </w:r>
+    </w:p>
+    <w:p/>
+    <w:tbl>
+      <w:tblPr>
+        <w:tblW w:type="auto" w:w="0"/>
+        <w:jc w:val="center"/>
+        <w:tblLook w:firstColumn="1" w:firstRow="1" w:lastColumn="0" w:lastRow="0" w:noHBand="0" w:noVBand="1" w:val="04A0"/>
+        <w:tblBorders>
+          <w:top w:val="single" w:sz="4" w:space="0" w:color="000000"/>
+          <w:left w:val="single" w:sz="4" w:space="0" w:color="000000"/>
+          <w:bottom w:val="single" w:sz="4" w:space="0" w:color="000000"/>
+          <w:right w:val="single" w:sz="4" w:space="0" w:color="000000"/>
+          <w:insideH w:val="single" w:sz="4" w:space="0" w:color="000000"/>
+          <w:insideV w:val="single" w:sz="4" w:space="0" w:color="000000"/>
+        </w:tblBorders>
+      </w:tblPr>
+      <w:tblGrid>
+        <w:gridCol w:w="1440"/>
+        <w:gridCol w:w="1440"/>
+        <w:gridCol w:w="1440"/>
+        <w:gridCol w:w="1440"/>
+        <w:gridCol w:w="1440"/>
+        <w:gridCol w:w="1440"/>
+      </w:tblGrid>
+      <w:tr>
+        <w:tc>
+          <w:tcPr>
+            <w:tcW w:type="dxa" w:w="1440"/>
+          </w:tcPr>
+          <w:p>
+            <w:r>
+              <w:rPr>
+                <w:b/>
+              </w:rPr>
+              <w:t>Metode</w:t>
+            </w:r>
+          </w:p>
+        </w:tc>
+        <w:tc>
+          <w:tcPr>
+            <w:tcW w:type="dxa" w:w="1440"/>
+          </w:tcPr>
+          <w:p>
+            <w:r>
+              <w:rPr>
+                <w:b/>
+              </w:rPr>
+              <w:t>Tipe</w:t>
+            </w:r>
+          </w:p>
+        </w:tc>
+        <w:tc>
+          <w:tcPr>
+            <w:tcW w:type="dxa" w:w="1440"/>
+          </w:tcPr>
+          <w:p>
+            <w:r>
+              <w:rPr>
+                <w:b/>
+              </w:rPr>
+              <w:t>Output</w:t>
+            </w:r>
+          </w:p>
+        </w:tc>
+        <w:tc>
+          <w:tcPr>
+            <w:tcW w:type="dxa" w:w="1440"/>
+          </w:tcPr>
+          <w:p>
+            <w:r>
+              <w:rPr>
+                <w:b/>
+              </w:rPr>
+              <w:t>Kelebihan</w:t>
+            </w:r>
+          </w:p>
+        </w:tc>
+        <w:tc>
+          <w:tcPr>
+            <w:tcW w:type="dxa" w:w="1440"/>
+          </w:tcPr>
+          <w:p>
+            <w:r>
+              <w:rPr>
+                <w:b/>
+              </w:rPr>
+              <w:t>Keterbatasan</w:t>
+            </w:r>
+          </w:p>
+        </w:tc>
+        <w:tc>
+          <w:tcPr>
+            <w:tcW w:type="dxa" w:w="1440"/>
+          </w:tcPr>
+          <w:p>
+            <w:r>
+              <w:rPr>
+                <w:b/>
+              </w:rPr>
+              <w:t>Relevansi</w:t>
+            </w:r>
+          </w:p>
+        </w:tc>
+      </w:tr>
+      <w:tr>
+        <w:tc>
+          <w:tcPr>
+            <w:tcW w:type="dxa" w:w="1440"/>
+          </w:tcPr>
+          <w:p>
+            <w:r>
+              <w:t>SHAP</w:t>
+            </w:r>
+          </w:p>
+        </w:tc>
+        <w:tc>
+          <w:tcPr>
+            <w:tcW w:type="dxa" w:w="1440"/>
+          </w:tcPr>
+          <w:p>
+            <w:r>
+              <w:t>Post-hoc diagnostik</w:t>
+            </w:r>
+          </w:p>
+        </w:tc>
+        <w:tc>
+          <w:tcPr>
+            <w:tcW w:type="dxa" w:w="1440"/>
+          </w:tcPr>
+          <w:p>
+            <w:r>
+              <w:t>Feature importance</w:t>
+            </w:r>
+          </w:p>
+        </w:tc>
+        <w:tc>
+          <w:tcPr>
+            <w:tcW w:type="dxa" w:w="1440"/>
+          </w:tcPr>
+          <w:p>
+            <w:r>
+              <w:t>Global+local explanation</w:t>
+            </w:r>
+          </w:p>
+        </w:tc>
+        <w:tc>
+          <w:tcPr>
+            <w:tcW w:type="dxa" w:w="1440"/>
+          </w:tcPr>
+          <w:p>
+            <w:r>
+              <w:t>Tidak preskriptif, hanya menjelaskan WHY</w:t>
+            </w:r>
+          </w:p>
+        </w:tc>
+        <w:tc>
+          <w:tcPr>
+            <w:tcW w:type="dxa" w:w="1440"/>
+          </w:tcPr>
+          <w:p>
+            <w:r>
+              <w:t>Tidak sesuai</w:t>
+            </w:r>
+          </w:p>
+        </w:tc>
+      </w:tr>
+      <w:tr>
+        <w:tc>
+          <w:tcPr>
+            <w:tcW w:type="dxa" w:w="1440"/>
+          </w:tcPr>
+          <w:p>
+            <w:r>
+              <w:t>LIME</w:t>
+            </w:r>
+          </w:p>
+        </w:tc>
+        <w:tc>
+          <w:tcPr>
+            <w:tcW w:type="dxa" w:w="1440"/>
+          </w:tcPr>
+          <w:p>
+            <w:r>
+              <w:t>Post-hoc diagnostik</w:t>
+            </w:r>
+          </w:p>
+        </w:tc>
+        <w:tc>
+          <w:tcPr>
+            <w:tcW w:type="dxa" w:w="1440"/>
+          </w:tcPr>
+          <w:p>
+            <w:r>
+              <w:t>Linear approximation</w:t>
+            </w:r>
+          </w:p>
+        </w:tc>
+        <w:tc>
+          <w:tcPr>
+            <w:tcW w:type="dxa" w:w="1440"/>
+          </w:tcPr>
+          <w:p>
+            <w:r>
+              <w:t>Model-agnostic</w:t>
+            </w:r>
+          </w:p>
+        </w:tc>
+        <w:tc>
+          <w:tcPr>
+            <w:tcW w:type="dxa" w:w="1440"/>
+          </w:tcPr>
+          <w:p>
+            <w:r>
+              <w:t>Tidak stabil, tidak preskriptif</w:t>
+            </w:r>
+          </w:p>
+        </w:tc>
+        <w:tc>
+          <w:tcPr>
+            <w:tcW w:type="dxa" w:w="1440"/>
+          </w:tcPr>
+          <w:p>
+            <w:r>
+              <w:t>Tidak sesuai</w:t>
+            </w:r>
+          </w:p>
+        </w:tc>
+      </w:tr>
+      <w:tr>
+        <w:tc>
+          <w:tcPr>
+            <w:tcW w:type="dxa" w:w="1440"/>
+          </w:tcPr>
+          <w:p>
+            <w:r>
+              <w:t>CF (DiCE)</w:t>
+            </w:r>
+          </w:p>
+        </w:tc>
+        <w:tc>
+          <w:tcPr>
+            <w:tcW w:type="dxa" w:w="1440"/>
+          </w:tcPr>
+          <w:p>
+            <w:r>
+              <w:t>Preskriptif aktif</w:t>
+            </w:r>
+          </w:p>
+        </w:tc>
+        <w:tc>
+          <w:tcPr>
+            <w:tcW w:type="dxa" w:w="1440"/>
+          </w:tcPr>
+          <w:p>
+            <w:r>
+              <w:t>Perubahan fitur spesifik</w:t>
+            </w:r>
+          </w:p>
+        </w:tc>
+        <w:tc>
+          <w:tcPr>
+            <w:tcW w:type="dxa" w:w="1440"/>
+          </w:tcPr>
+          <w:p>
+            <w:r>
+              <w:t>Actionable, diverse, constrained</w:t>
+            </w:r>
+          </w:p>
+        </w:tc>
+        <w:tc>
+          <w:tcPr>
+            <w:tcW w:type="dxa" w:w="1440"/>
+          </w:tcPr>
+          <w:p>
+            <w:r>
+              <w:t>Bergantung kualitas model</w:t>
+            </w:r>
+          </w:p>
+        </w:tc>
+        <w:tc>
+          <w:tcPr>
+            <w:tcW w:type="dxa" w:w="1440"/>
+          </w:tcPr>
+          <w:p>
+            <w:r>
+              <w:t>Sesuai</w:t>
+            </w:r>
+          </w:p>
+        </w:tc>
+      </w:tr>
+    </w:tbl>
+    <w:p/>
+    <w:p>
+      <w:r>
+        <w:rPr>
+          <w:b/>
+        </w:rPr>
+        <w:t xml:space="preserve">Kesimpulan: </w:t>
+      </w:r>
+      <w:r>
+        <w:t>DiCE dipilih karena merupakan satu-satunya metode yang bersifat preskriptif (memberikan HOW, bukan hanya WHY). SHAP dan LIME hanya bersifat diagnostik - menjelaskan fitur mana yang berpengaruh, namun tidak memberikan rekomendasi perubahan spesifik yang actionable untuk memperbaiki kualitas air.</w:t>
+      </w:r>
+    </w:p>
+    <w:p>
+      <w:r>
+        <w:br w:type="page"/>
+      </w:r>
+    </w:p>
+    <w:p>
+      <w:pPr>
+        <w:pStyle w:val="Heading2"/>
+      </w:pPr>
+      <w:r>
+        <w:t>REVISI 24: JUSTIFIKASI NGBoost</w:t>
+      </w:r>
+    </w:p>
+    <w:p>
+      <w:r>
+        <w:t>Lokasi: Akhir sub-bab 2.2.3 (tambahkan paragraf justifikasi)</w:t>
+      </w:r>
+    </w:p>
+    <w:p>
+      <w:r>
+        <w:t>Alasan: Dosen kemungkinan bertanya "Kenapa NGBoost? Kenapa bukan BNN atau deep learning?"</w:t>
+      </w:r>
+    </w:p>
+    <w:p/>
+    <w:p>
+      <w:r>
+        <w:rPr>
+          <w:b/>
+        </w:rPr>
+        <w:t>Paragraf yang ditambahkan:</w:t>
+      </w:r>
+    </w:p>
+    <w:p>
+      <w:r>
+        <w:t>NGBoost dipilih sebagai model probabilistik dalam penelitian ini berdasarkan pertimbangan berikut: (1) Bayesian Neural Network (BNN) memiliki kompleksitas komputasi tinggi dan sulit di-tune untuk dataset tabular berukuran kecil-sedang; (2) MC Dropout hanya memberikan approximate uncertainty dan memerlukan arsitektur neural network yang tidak optimal untuk data tabular; (3) Deep learning secara umum menunjukkan performa inferior dibandingkan gradient boosting pada dataset tabular berukuran kecil (Grinsztajn et al., 2022); (4) NGBoost secara native menghasilkan distribusi probabilitas penuh melalui Natural Gradient descent, bukan hanya point estimate; (5) NGBoost kompatibel dengan framework DiCE melalui method predict_proba yang diperlukan untuk pembangkitan counterfactual. Kombinasi performa kompetitif pada data tabular dan kompatibilitas dengan DiCE menjadikan NGBoost pilihan yang optimal untuk kerangka preskriptif ini.</w:t>
+      </w:r>
+    </w:p>
+    <w:p>
+      <w:r>
+        <w:br w:type="page"/>
+      </w:r>
+    </w:p>
+    <w:p>
+      <w:pPr>
+        <w:pStyle w:val="Heading2"/>
+      </w:pPr>
+      <w:r>
+        <w:t>REVISI 25: JUSTIFIKASI DiCE</w:t>
+      </w:r>
+    </w:p>
+    <w:p>
+      <w:r>
+        <w:t>Lokasi: Akhir sub-bab 2.2.5 (tambahkan paragraf justifikasi)</w:t>
+      </w:r>
+    </w:p>
+    <w:p>
+      <w:r>
+        <w:t>Alasan: Perlu justifikasi mengapa DiCE dipilih dibandingkan metode counterfactual lain.</w:t>
+      </w:r>
+    </w:p>
+    <w:p/>
+    <w:p>
+      <w:r>
+        <w:rPr>
+          <w:b/>
+        </w:rPr>
+        <w:t>Paragraf yang ditambahkan:</w:t>
+      </w:r>
+    </w:p>
+    <w:p>
+      <w:r>
+        <w:t>DiCE dipilih sebagai framework counterfactual dalam penelitian ini berdasarkan pertimbangan berikut: (1) Metode Wachter et al. (2017) hanya menghasilkan 1 counterfactual per instance, tidak memberikan alternatif rekomendasi; (2) FACE (Feasible Actionable Counterfactual Explanations) kurang fleksibel dalam mendefinisikan constraints domain-specific; (3) Growing Spheres tidak mendukung multi-objective optimization (validity + proximity + diversity secara simultan); (4) DiCE menghasilkan diverse counterfactuals (k&gt;1) yang memberikan multiple actionable paths; (5) DiCE mendukung permitted_range untuk constraint domain (Permenkes/WHO) dan features_to_vary untuk kontrol actionability; (6) Library dice-ml sudah mature, well-documented, dan compatible dengan scikit-learn API yang digunakan NGBoost. Keunggulan DiCE dalam menghasilkan diverse, constrained, dan actionable counterfactuals menjadikannya pilihan optimal untuk domain kualitas air.</w:t>
+      </w:r>
+    </w:p>
+    <w:p>
+      <w:r>
+        <w:br w:type="page"/>
+      </w:r>
+    </w:p>
+    <w:p>
+      <w:pPr>
+        <w:pStyle w:val="Heading2"/>
+      </w:pPr>
+      <w:r>
+        <w:t>REVISI 26: BATASAN KONSEP PROBABILISTIK</w:t>
+      </w:r>
+    </w:p>
+    <w:p>
+      <w:r>
+        <w:t>Lokasi: Sub-bab 2.2.3 (sisipkan di awal atau setelah penjelasan NGBoost)</w:t>
+      </w:r>
+    </w:p>
+    <w:p>
+      <w:r>
+        <w:t>Alasan: Menghindari miskonsepsi bahwa "probabilistik" = Bayesian inference penuh.</w:t>
+      </w:r>
+    </w:p>
+    <w:p/>
+    <w:p>
+      <w:r>
+        <w:rPr>
+          <w:b/>
+        </w:rPr>
+        <w:t>Teks yang disisipkan:</w:t>
+      </w:r>
+    </w:p>
+    <w:p>
+      <w:r>
+        <w:t>Catatan penting: "Probabilistik" dalam konteks penelitian ini merujuk pada pemodelan distribusi Bernoulli melalui NGBoost, BUKAN Bayesian inference penuh (seperti BNN, Gaussian Process, atau MC Dropout). Uncertainty yang diestimasi bersifat aleatoric (ketidakpastian data), yang direpresentasikan sebagai mu*(1-mu) dari distribusi Bernoulli, bukan epistemic uncertainty (ketidakpastian model). Distingsi ini penting agar tidak terjadi overclaim terhadap kemampuan uncertainty estimation dari model yang digunakan.</w:t>
+      </w:r>
+    </w:p>
+    <w:p>
+      <w:r>
+        <w:br w:type="page"/>
+      </w:r>
+    </w:p>
+    <w:p>
+      <w:pPr>
+        <w:pStyle w:val="Heading2"/>
+      </w:pPr>
+      <w:r>
+        <w:t>REVISI 27: WHAT-IF ANALYSIS</w:t>
+      </w:r>
+    </w:p>
+    <w:p>
+      <w:r>
+        <w:t>Lokasi: Sub-bab 2.3 (sisipkan sebelum paragraf penutup)</w:t>
+      </w:r>
+    </w:p>
+    <w:p>
+      <w:r>
+        <w:t>Alasan: Memperkuat argumentasi mengapa integrasi NGBoost+DiCE diperlukan vs alternatif.</w:t>
+      </w:r>
+    </w:p>
+    <w:p/>
+    <w:p>
+      <w:r>
+        <w:rPr>
+          <w:b/>
+        </w:rPr>
+        <w:t>Teks yang disisipkan:</w:t>
+      </w:r>
+    </w:p>
+    <w:p>
+      <w:r>
+        <w:t>Untuk memperjelas kontribusi integrasi yang diusulkan, berikut analisis what-if terhadap alternatif: (1) Jika menggunakan XGBoost saja: model menghasilkan prediksi deterministik tanpa estimasi uncertainty, sehingga operator tidak mengetahui tingkat keyakinan prediksi; (2) Jika menggunakan SHAP saja: output hanya bersifat diagnostik (menjelaskan fitur mana yang berpengaruh), tanpa memberikan rekomendasi perubahan spesifik yang actionable; (3) Integrasi NGBoost + DiCE mengatasi kedua limitasi tersebut secara simultan - NGBoost memberikan prediksi dengan uncertainty estimation, dan DiCE mentransformasi prediksi tersebut menjadi rekomendasi preskriptif yang actionable dan constrained.</w:t>
+      </w:r>
+    </w:p>
+    <w:p>
+      <w:r>
+        <w:br w:type="page"/>
+      </w:r>
+    </w:p>
+    <w:p>
+      <w:pPr>
+        <w:pStyle w:val="Heading2"/>
+      </w:pPr>
+      <w:r>
+        <w:t>REVISI 28: NOVELITAS STATEMENT</w:t>
+      </w:r>
+    </w:p>
+    <w:p>
+      <w:r>
+        <w:t>Lokasi: Kalimat terakhir sub-bab 2.3</w:t>
+      </w:r>
+    </w:p>
+    <w:p>
+      <w:r>
+        <w:t>Alasan: Perlu kalimat penutup yang menegaskan novelitas/kontribusi utama penelitian.</w:t>
+      </w:r>
+    </w:p>
+    <w:p/>
+    <w:p>
+      <w:r>
+        <w:rPr>
+          <w:b/>
+        </w:rPr>
+        <w:t>Ganti kalimat penutup sub-bab 2.3 menjadi:</w:t>
+      </w:r>
+    </w:p>
+    <w:p>
+      <w:r>
+        <w:t>"Penelitian ini merupakan first practical implementation yang mengintegrasikan NGBoost sebagai model probabilistik dengan DiCE sebagai framework preskriptif pada domain kualitas air, dengan feasibility constraints berbasis regulasi nasional (Permenkes No. 2/2023) dan internasional (WHO Guidelines 2022). Kontribusi ini menjembatani kesenjangan antara kemampuan prediktif machine learning dan kebutuhan operasional di lapangan."</w:t>
+      </w:r>
+    </w:p>
+    <w:p>
+      <w:r>
+        <w:br w:type="page"/>
+      </w:r>
+    </w:p>
+    <w:p>
+      <w:pPr>
+        <w:pStyle w:val="Heading2"/>
+      </w:pPr>
+      <w:r>
         <w:t>STRATEGI SIDANG</w:t>
       </w:r>
     </w:p>
@@ -6039,7 +6558,7 @@
     </w:p>
     <w:p>
       <w:r>
-        <w:t>L1: "Dataset publik Kaggle, CC0, 99+ paper Scopus."</w:t>
+        <w:t>L1: "Dataset publik Kaggle, CC0, 99+ paper Scopus termasuk Patel et al. (2022)."</w:t>
       </w:r>
     </w:p>
     <w:p>
@@ -6145,6 +6664,29 @@
       </w:r>
     </w:p>
     <w:p>
+      <w:pPr>
+        <w:pStyle w:val="Heading3"/>
+      </w:pPr>
+      <w:r>
+        <w:t>Pertanyaan Teori &amp; Metode</w:t>
+      </w:r>
+    </w:p>
+    <w:p>
+      <w:r>
+        <w:t>L1: "NGBoost = probabilistik via Bernoulli + Natural Gradient. DiCE = preskriptif via diverse counterfactuals dengan constraints. Integrasi keduanya = prediksi + uncertainty + rekomendasi actionable."</w:t>
+      </w:r>
+    </w:p>
+    <w:p>
+      <w:r>
+        <w:t>L2: "NGBoost dipilih vs BNN (terlalu kompleks untuk tabular kecil), vs MC Dropout (approximate), vs deep learning (inferior pada tabular - Grinsztajn 2022). DiCE dipilih vs Wachter (hanya 1 CF), vs FACE (kurang flexible constraints), vs Growing Spheres (tidak multi-objective)."</w:t>
+      </w:r>
+    </w:p>
+    <w:p>
+      <w:r>
+        <w:t>L3: "Probabilistik di sini = aleatoric uncertainty via Bernoulli mu*(1-mu), BUKAN epistemic/Bayesian. What-if: XGBoost saja = tanpa uncertainty, SHAP saja = diagnostik only. NGBoost+DiCE = solusi simultan untuk kedua limitasi. First implementation di domain air dengan constraints Permenkes+WHO."</w:t>
+      </w:r>
+    </w:p>
+    <w:p>
       <w:r>
         <w:br w:type="page"/>
       </w:r>
@@ -6154,7 +6696,7 @@
         <w:pStyle w:val="Heading2"/>
       </w:pPr>
       <w:r>
-        <w:t>CHECKLIST REVISI (22 Item)</w:t>
+        <w:t>CHECKLIST REVISI (28 Item)</w:t>
       </w:r>
     </w:p>
     <w:tbl>
@@ -7623,6 +8165,378 @@
           </w:p>
         </w:tc>
       </w:tr>
+      <w:tr>
+        <w:tc>
+          <w:tcPr>
+            <w:tcW w:type="dxa" w:w="1440"/>
+          </w:tcPr>
+          <w:p>
+            <w:r>
+              <w:t>23</w:t>
+            </w:r>
+          </w:p>
+        </w:tc>
+        <w:tc>
+          <w:tcPr>
+            <w:tcW w:type="dxa" w:w="1440"/>
+          </w:tcPr>
+          <w:p>
+            <w:r>
+              <w:t>Tabel Perbandingan XAI</w:t>
+            </w:r>
+          </w:p>
+        </w:tc>
+        <w:tc>
+          <w:tcPr>
+            <w:tcW w:type="dxa" w:w="1440"/>
+          </w:tcPr>
+          <w:p>
+            <w:r>
+              <w:t>Sub.2.2.4</w:t>
+            </w:r>
+          </w:p>
+        </w:tc>
+        <w:tc>
+          <w:tcPr>
+            <w:tcW w:type="dxa" w:w="1440"/>
+          </w:tcPr>
+          <w:p>
+            <w:r>
+              <w:t>Tambah tabel SHAP vs LIME vs DiCE</w:t>
+            </w:r>
+          </w:p>
+        </w:tc>
+        <w:tc>
+          <w:tcPr>
+            <w:tcW w:type="dxa" w:w="1440"/>
+          </w:tcPr>
+          <w:p>
+            <w:r>
+              <w:t>TINGGI</w:t>
+            </w:r>
+          </w:p>
+        </w:tc>
+        <w:tc>
+          <w:tcPr>
+            <w:tcW w:type="dxa" w:w="1440"/>
+          </w:tcPr>
+          <w:p>
+            <w:r>
+              <w:t>[ ]</w:t>
+            </w:r>
+          </w:p>
+        </w:tc>
+      </w:tr>
+      <w:tr>
+        <w:tc>
+          <w:tcPr>
+            <w:tcW w:type="dxa" w:w="1440"/>
+          </w:tcPr>
+          <w:p>
+            <w:r>
+              <w:t>24</w:t>
+            </w:r>
+          </w:p>
+        </w:tc>
+        <w:tc>
+          <w:tcPr>
+            <w:tcW w:type="dxa" w:w="1440"/>
+          </w:tcPr>
+          <w:p>
+            <w:r>
+              <w:t>Justifikasi NGBoost</w:t>
+            </w:r>
+          </w:p>
+        </w:tc>
+        <w:tc>
+          <w:tcPr>
+            <w:tcW w:type="dxa" w:w="1440"/>
+          </w:tcPr>
+          <w:p>
+            <w:r>
+              <w:t>Sub.2.2.3</w:t>
+            </w:r>
+          </w:p>
+        </w:tc>
+        <w:tc>
+          <w:tcPr>
+            <w:tcW w:type="dxa" w:w="1440"/>
+          </w:tcPr>
+          <w:p>
+            <w:r>
+              <w:t>Tambah paragraf justifikasi</w:t>
+            </w:r>
+          </w:p>
+        </w:tc>
+        <w:tc>
+          <w:tcPr>
+            <w:tcW w:type="dxa" w:w="1440"/>
+          </w:tcPr>
+          <w:p>
+            <w:r>
+              <w:t>TINGGI</w:t>
+            </w:r>
+          </w:p>
+        </w:tc>
+        <w:tc>
+          <w:tcPr>
+            <w:tcW w:type="dxa" w:w="1440"/>
+          </w:tcPr>
+          <w:p>
+            <w:r>
+              <w:t>[ ]</w:t>
+            </w:r>
+          </w:p>
+        </w:tc>
+      </w:tr>
+      <w:tr>
+        <w:tc>
+          <w:tcPr>
+            <w:tcW w:type="dxa" w:w="1440"/>
+          </w:tcPr>
+          <w:p>
+            <w:r>
+              <w:t>25</w:t>
+            </w:r>
+          </w:p>
+        </w:tc>
+        <w:tc>
+          <w:tcPr>
+            <w:tcW w:type="dxa" w:w="1440"/>
+          </w:tcPr>
+          <w:p>
+            <w:r>
+              <w:t>Justifikasi DiCE</w:t>
+            </w:r>
+          </w:p>
+        </w:tc>
+        <w:tc>
+          <w:tcPr>
+            <w:tcW w:type="dxa" w:w="1440"/>
+          </w:tcPr>
+          <w:p>
+            <w:r>
+              <w:t>Sub.2.2.5</w:t>
+            </w:r>
+          </w:p>
+        </w:tc>
+        <w:tc>
+          <w:tcPr>
+            <w:tcW w:type="dxa" w:w="1440"/>
+          </w:tcPr>
+          <w:p>
+            <w:r>
+              <w:t>Tambah paragraf justifikasi</w:t>
+            </w:r>
+          </w:p>
+        </w:tc>
+        <w:tc>
+          <w:tcPr>
+            <w:tcW w:type="dxa" w:w="1440"/>
+          </w:tcPr>
+          <w:p>
+            <w:r>
+              <w:t>TINGGI</w:t>
+            </w:r>
+          </w:p>
+        </w:tc>
+        <w:tc>
+          <w:tcPr>
+            <w:tcW w:type="dxa" w:w="1440"/>
+          </w:tcPr>
+          <w:p>
+            <w:r>
+              <w:t>[ ]</w:t>
+            </w:r>
+          </w:p>
+        </w:tc>
+      </w:tr>
+      <w:tr>
+        <w:tc>
+          <w:tcPr>
+            <w:tcW w:type="dxa" w:w="1440"/>
+          </w:tcPr>
+          <w:p>
+            <w:r>
+              <w:t>26</w:t>
+            </w:r>
+          </w:p>
+        </w:tc>
+        <w:tc>
+          <w:tcPr>
+            <w:tcW w:type="dxa" w:w="1440"/>
+          </w:tcPr>
+          <w:p>
+            <w:r>
+              <w:t>Batasan Probabilistik</w:t>
+            </w:r>
+          </w:p>
+        </w:tc>
+        <w:tc>
+          <w:tcPr>
+            <w:tcW w:type="dxa" w:w="1440"/>
+          </w:tcPr>
+          <w:p>
+            <w:r>
+              <w:t>Sub.2.2.3</w:t>
+            </w:r>
+          </w:p>
+        </w:tc>
+        <w:tc>
+          <w:tcPr>
+            <w:tcW w:type="dxa" w:w="1440"/>
+          </w:tcPr>
+          <w:p>
+            <w:r>
+              <w:t>Sisipkan klarifikasi konsep</w:t>
+            </w:r>
+          </w:p>
+        </w:tc>
+        <w:tc>
+          <w:tcPr>
+            <w:tcW w:type="dxa" w:w="1440"/>
+          </w:tcPr>
+          <w:p>
+            <w:r>
+              <w:t>SEDANG</w:t>
+            </w:r>
+          </w:p>
+        </w:tc>
+        <w:tc>
+          <w:tcPr>
+            <w:tcW w:type="dxa" w:w="1440"/>
+          </w:tcPr>
+          <w:p>
+            <w:r>
+              <w:t>[ ]</w:t>
+            </w:r>
+          </w:p>
+        </w:tc>
+      </w:tr>
+      <w:tr>
+        <w:tc>
+          <w:tcPr>
+            <w:tcW w:type="dxa" w:w="1440"/>
+          </w:tcPr>
+          <w:p>
+            <w:r>
+              <w:t>27</w:t>
+            </w:r>
+          </w:p>
+        </w:tc>
+        <w:tc>
+          <w:tcPr>
+            <w:tcW w:type="dxa" w:w="1440"/>
+          </w:tcPr>
+          <w:p>
+            <w:r>
+              <w:t>What-If Analysis</w:t>
+            </w:r>
+          </w:p>
+        </w:tc>
+        <w:tc>
+          <w:tcPr>
+            <w:tcW w:type="dxa" w:w="1440"/>
+          </w:tcPr>
+          <w:p>
+            <w:r>
+              <w:t>Sub.2.3</w:t>
+            </w:r>
+          </w:p>
+        </w:tc>
+        <w:tc>
+          <w:tcPr>
+            <w:tcW w:type="dxa" w:w="1440"/>
+          </w:tcPr>
+          <w:p>
+            <w:r>
+              <w:t>Sisipkan analisis alternatif</w:t>
+            </w:r>
+          </w:p>
+        </w:tc>
+        <w:tc>
+          <w:tcPr>
+            <w:tcW w:type="dxa" w:w="1440"/>
+          </w:tcPr>
+          <w:p>
+            <w:r>
+              <w:t>SEDANG</w:t>
+            </w:r>
+          </w:p>
+        </w:tc>
+        <w:tc>
+          <w:tcPr>
+            <w:tcW w:type="dxa" w:w="1440"/>
+          </w:tcPr>
+          <w:p>
+            <w:r>
+              <w:t>[ ]</w:t>
+            </w:r>
+          </w:p>
+        </w:tc>
+      </w:tr>
+      <w:tr>
+        <w:tc>
+          <w:tcPr>
+            <w:tcW w:type="dxa" w:w="1440"/>
+          </w:tcPr>
+          <w:p>
+            <w:r>
+              <w:t>28</w:t>
+            </w:r>
+          </w:p>
+        </w:tc>
+        <w:tc>
+          <w:tcPr>
+            <w:tcW w:type="dxa" w:w="1440"/>
+          </w:tcPr>
+          <w:p>
+            <w:r>
+              <w:t>Novelitas Statement</w:t>
+            </w:r>
+          </w:p>
+        </w:tc>
+        <w:tc>
+          <w:tcPr>
+            <w:tcW w:type="dxa" w:w="1440"/>
+          </w:tcPr>
+          <w:p>
+            <w:r>
+              <w:t>Sub.2.3</w:t>
+            </w:r>
+          </w:p>
+        </w:tc>
+        <w:tc>
+          <w:tcPr>
+            <w:tcW w:type="dxa" w:w="1440"/>
+          </w:tcPr>
+          <w:p>
+            <w:r>
+              <w:t>Ganti kalimat penutup</w:t>
+            </w:r>
+          </w:p>
+        </w:tc>
+        <w:tc>
+          <w:tcPr>
+            <w:tcW w:type="dxa" w:w="1440"/>
+          </w:tcPr>
+          <w:p>
+            <w:r>
+              <w:t>TINGGI</w:t>
+            </w:r>
+          </w:p>
+        </w:tc>
+        <w:tc>
+          <w:tcPr>
+            <w:tcW w:type="dxa" w:w="1440"/>
+          </w:tcPr>
+          <w:p>
+            <w:r>
+              <w:t>[ ]</w:t>
+            </w:r>
+          </w:p>
+        </w:tc>
+      </w:tr>
     </w:tbl>
     <w:p/>
     <w:p>
@@ -7635,7 +8549,7 @@
         <w:pStyle w:val="Heading2"/>
       </w:pPr>
       <w:r>
-        <w:t>CATATAN PENTING (11 item)</w:t>
+        <w:t>CATATAN PENTING (12 item)</w:t>
       </w:r>
     </w:p>
     <w:p>
@@ -7691,6 +8605,11 @@
     <w:p>
       <w:r>
         <w:t>11. Manfaat penelitian TIDAK perlu ditambahkan sebagai sub-bab (tidak ada di template) - siapkan jawaban lisan saja</w:t>
+      </w:r>
+    </w:p>
+    <w:p>
+      <w:r>
+        <w:t>12. Justifikasi metode (NGBoost, DiCE) harus EKSPLISIT di BAB 2 - jangan hanya deskripsi teori tanpa alasan pemilihan. Siapkan jawaban 3 level untuk pertanyaan "kenapa metode ini?"</w:t>
       </w:r>
     </w:p>
     <w:sectPr>

</xml_diff>

<commit_message>
Update revisi v8 FINAL: koreksi constraint Permenkes, 2 skenario, konsolidasi referensi
</commit_message>
<xml_diff>
--- a/REVISI_PROPOSAL_AFLAH.docx
+++ b/REVISI_PROPOSAL_AFLAH.docx
@@ -8,7 +8,7 @@
         <w:jc w:val="center"/>
       </w:pPr>
       <w:r>
-        <w:t>PANDUAN REVISI PROPOSAL TUGAS AKHIR (v7 - Lokasi Spesifik)</w:t>
+        <w:t>PANDUAN REVISI PROPOSAL TUGAS AKHIR (v8 - FINAL)</w:t>
       </w:r>
     </w:p>
     <w:p>
@@ -35,7 +35,7 @@
         <w:jc w:val="center"/>
       </w:pPr>
       <w:r>
-        <w:t>Dokumen panduan revisi final (28 revisi). Versi 7 menambahkan lokasi spesifik (halaman, paragraf, kalimat anchor) + format italic untuk teks revisi.</w:t>
+        <w:t>Dokumen panduan revisi FINAL (28 revisi + koreksi constraint). Versi 8: koreksi angka Permenkes, narasi 2 skenario constraint, konsolidasi referensi.</w:t>
       </w:r>
     </w:p>
     <w:p>
@@ -4735,7 +4735,7 @@
         <w:pStyle w:val="Heading2"/>
       </w:pPr>
       <w:r>
-        <w:t>REVISI 15: CONSTRAINT DOMAIN</w:t>
+        <w:t>REVISI 15: CONSTRAINT DOMAIN (2 SKENARIO)</w:t>
       </w:r>
     </w:p>
     <w:p>
@@ -4746,7 +4746,16 @@
     <w:p/>
     <w:p>
       <w:r>
-        <w:t>Feasibility constraints berdasarkan Permenkes No. 2/2023 (primary) + WHO Guidelines 2022 (komplementer untuk Conductivity dan Organic Carbon).</w:t>
+        <w:t>Constraint dibagi menjadi 2 skenario: GENERATION (WHO) dan EVALUASI (Permenkes).</w:t>
+      </w:r>
+    </w:p>
+    <w:p/>
+    <w:p>
+      <w:r>
+        <w:rPr>
+          <w:b/>
+        </w:rPr>
+        <w:t>BAGIAN A: Tabel Constraint GENERATION (untuk DiCE - WHO Guidelines 2022)</w:t>
       </w:r>
     </w:p>
     <w:p/>
@@ -4793,7 +4802,7 @@
               <w:rPr>
                 <w:b/>
               </w:rPr>
-              <w:t>Sumber</w:t>
+              <w:t>WHO Guideline</w:t>
             </w:r>
           </w:p>
         </w:tc>
@@ -4806,7 +4815,7 @@
               <w:rPr>
                 <w:b/>
               </w:rPr>
-              <w:t>Range</w:t>
+              <w:t>Permitted Range DiCE</w:t>
             </w:r>
           </w:p>
         </w:tc>
@@ -4841,7 +4850,7 @@
           </w:tcPr>
           <w:p>
             <w:r>
-              <w:t>Permenkes</w:t>
+              <w:t>6.5-8.5</w:t>
             </w:r>
           </w:p>
         </w:tc>
@@ -4861,7 +4870,7 @@
           </w:tcPr>
           <w:p>
             <w:r>
-              <w:t>Langsung</w:t>
+              <w:t>Sama dgn Permenkes</w:t>
             </w:r>
           </w:p>
         </w:tc>
@@ -4883,7 +4892,7 @@
           </w:tcPr>
           <w:p>
             <w:r>
-              <w:t>Permenkes</w:t>
+              <w:t>&lt;500 mg/L</w:t>
             </w:r>
           </w:p>
         </w:tc>
@@ -4893,7 +4902,7 @@
           </w:tcPr>
           <w:p>
             <w:r>
-              <w:t>0-500 mg/L</w:t>
+              <w:t>0-500</w:t>
             </w:r>
           </w:p>
         </w:tc>
@@ -4903,7 +4912,7 @@
           </w:tcPr>
           <w:p>
             <w:r>
-              <w:t>CaCO3</w:t>
+              <w:t>Acceptability</w:t>
             </w:r>
           </w:p>
         </w:tc>
@@ -4915,7 +4924,7 @@
           </w:tcPr>
           <w:p>
             <w:r>
-              <w:t>TDS</w:t>
+              <w:t>TDS (Solids)</w:t>
             </w:r>
           </w:p>
         </w:tc>
@@ -4925,7 +4934,7 @@
           </w:tcPr>
           <w:p>
             <w:r>
-              <w:t>Permenkes</w:t>
+              <w:t>&lt;1000 mg/L (taste)</w:t>
             </w:r>
           </w:p>
         </w:tc>
@@ -4935,7 +4944,7 @@
           </w:tcPr>
           <w:p>
             <w:r>
-              <w:t>0-1000 mg/L</w:t>
+              <w:t>0-1000</w:t>
             </w:r>
           </w:p>
         </w:tc>
@@ -4945,7 +4954,7 @@
           </w:tcPr>
           <w:p>
             <w:r>
-              <w:t>Langsung</w:t>
+              <w:t>Health: not concern</w:t>
             </w:r>
           </w:p>
         </w:tc>
@@ -4967,7 +4976,7 @@
           </w:tcPr>
           <w:p>
             <w:r>
-              <w:t>Permenkes*</w:t>
+              <w:t>3 mg/L</w:t>
             </w:r>
           </w:p>
         </w:tc>
@@ -4977,7 +4986,7 @@
           </w:tcPr>
           <w:p>
             <w:r>
-              <w:t>0-5 mg/L</w:t>
+              <w:t>0-3</w:t>
             </w:r>
           </w:p>
         </w:tc>
@@ -4987,7 +4996,7 @@
           </w:tcPr>
           <w:p>
             <w:r>
-              <w:t>*Dari Sisa Klor</w:t>
+              <w:t>Guideline value</w:t>
             </w:r>
           </w:p>
         </w:tc>
@@ -5009,7 +5018,7 @@
           </w:tcPr>
           <w:p>
             <w:r>
-              <w:t>Permenkes</w:t>
+              <w:t>&lt;500 mg/L (taste)</w:t>
             </w:r>
           </w:p>
         </w:tc>
@@ -5019,7 +5028,7 @@
           </w:tcPr>
           <w:p>
             <w:r>
-              <w:t>0-400 mg/L</w:t>
+              <w:t>0-500</w:t>
             </w:r>
           </w:p>
         </w:tc>
@@ -5029,7 +5038,7 @@
           </w:tcPr>
           <w:p>
             <w:r>
-              <w:t>Langsung</w:t>
+              <w:t>No health-based GV</w:t>
             </w:r>
           </w:p>
         </w:tc>
@@ -5051,7 +5060,7 @@
           </w:tcPr>
           <w:p>
             <w:r>
-              <w:t>WHO(2022)</w:t>
+              <w:t>No formal GV</w:t>
             </w:r>
           </w:p>
         </w:tc>
@@ -5061,7 +5070,7 @@
           </w:tcPr>
           <w:p>
             <w:r>
-              <w:t>0-1500 uS/cm</w:t>
+              <w:t>Data-driven (P5-P95)</w:t>
             </w:r>
           </w:p>
         </w:tc>
@@ -5071,7 +5080,7 @@
           </w:tcPr>
           <w:p>
             <w:r>
-              <w:t>Tidak di Permenkes</w:t>
+              <w:t>Tidak ada standar formal</w:t>
             </w:r>
           </w:p>
         </w:tc>
@@ -5093,7 +5102,7 @@
           </w:tcPr>
           <w:p>
             <w:r>
-              <w:t>WHO(2022)</w:t>
+              <w:t>No formal GV</w:t>
             </w:r>
           </w:p>
         </w:tc>
@@ -5103,7 +5112,7 @@
           </w:tcPr>
           <w:p>
             <w:r>
-              <w:t>0-25 mg/L</w:t>
+              <w:t>Data-driven (P5-P95)</w:t>
             </w:r>
           </w:p>
         </w:tc>
@@ -5113,7 +5122,7 @@
           </w:tcPr>
           <w:p>
             <w:r>
-              <w:t>Tidak langsung(KMnO4)</w:t>
+              <w:t>Tidak ada standar formal</w:t>
             </w:r>
           </w:p>
         </w:tc>
@@ -5135,7 +5144,7 @@
           </w:tcPr>
           <w:p>
             <w:r>
-              <w:t>Permenkes</w:t>
+              <w:t>&lt;200 ug/L (total THMs)</w:t>
             </w:r>
           </w:p>
         </w:tc>
@@ -5145,7 +5154,7 @@
           </w:tcPr>
           <w:p>
             <w:r>
-              <w:t>0-80 ug/L</w:t>
+              <w:t>0-200</w:t>
             </w:r>
           </w:p>
         </w:tc>
@@ -5155,7 +5164,7 @@
           </w:tcPr>
           <w:p>
             <w:r>
-              <w:t>Langsung</w:t>
+              <w:t>Sum of 4 THMs</w:t>
             </w:r>
           </w:p>
         </w:tc>
@@ -5177,7 +5186,7 @@
           </w:tcPr>
           <w:p>
             <w:r>
-              <w:t>Permenkes</w:t>
+              <w:t>&lt;4 NTU (disinfection)</w:t>
             </w:r>
           </w:p>
         </w:tc>
@@ -5187,7 +5196,7 @@
           </w:tcPr>
           <w:p>
             <w:r>
-              <w:t>0-5 NTU</w:t>
+              <w:t>0-4</w:t>
             </w:r>
           </w:p>
         </w:tc>
@@ -5197,7 +5206,7 @@
           </w:tcPr>
           <w:p>
             <w:r>
-              <w:t>Langsung</w:t>
+              <w:t>Ideally &lt;1</w:t>
             </w:r>
           </w:p>
         </w:tc>
@@ -5206,7 +5215,478 @@
     <w:p/>
     <w:p>
       <w:r>
-        <w:t>Catatan: Distribusi dataset melampaui batas regulasi (TDS hingga 61.227 vs max 1.000). Instance jauh dari range menghasilkan feasibility rendah - ini menjadi temuan penelitian.</w:t>
+        <w:rPr>
+          <w:b/>
+        </w:rPr>
+        <w:t>BAGIAN B: Tabel Constraint EVALUASI (Permenkes No. 2 Tahun 2023 - Tabel 1 Parameter Wajib)</w:t>
+      </w:r>
+    </w:p>
+    <w:p/>
+    <w:tbl>
+      <w:tblPr>
+        <w:tblW w:type="auto" w:w="0"/>
+        <w:jc w:val="center"/>
+        <w:tblLook w:firstColumn="1" w:firstRow="1" w:lastColumn="0" w:lastRow="0" w:noHBand="0" w:noVBand="1" w:val="04A0"/>
+        <w:tblBorders>
+          <w:top w:val="single" w:sz="4" w:space="0" w:color="000000"/>
+          <w:left w:val="single" w:sz="4" w:space="0" w:color="000000"/>
+          <w:bottom w:val="single" w:sz="4" w:space="0" w:color="000000"/>
+          <w:right w:val="single" w:sz="4" w:space="0" w:color="000000"/>
+          <w:insideH w:val="single" w:sz="4" w:space="0" w:color="000000"/>
+          <w:insideV w:val="single" w:sz="4" w:space="0" w:color="000000"/>
+        </w:tblBorders>
+      </w:tblPr>
+      <w:tblGrid>
+        <w:gridCol w:w="2160"/>
+        <w:gridCol w:w="2160"/>
+        <w:gridCol w:w="2160"/>
+        <w:gridCol w:w="2160"/>
+      </w:tblGrid>
+      <w:tr>
+        <w:tc>
+          <w:tcPr>
+            <w:tcW w:type="dxa" w:w="2160"/>
+          </w:tcPr>
+          <w:p>
+            <w:r>
+              <w:rPr>
+                <w:b/>
+              </w:rPr>
+              <w:t>Parameter</w:t>
+            </w:r>
+          </w:p>
+        </w:tc>
+        <w:tc>
+          <w:tcPr>
+            <w:tcW w:type="dxa" w:w="2160"/>
+          </w:tcPr>
+          <w:p>
+            <w:r>
+              <w:rPr>
+                <w:b/>
+              </w:rPr>
+              <w:t>Permenkes Aktual</w:t>
+            </w:r>
+          </w:p>
+        </w:tc>
+        <w:tc>
+          <w:tcPr>
+            <w:tcW w:type="dxa" w:w="2160"/>
+          </w:tcPr>
+          <w:p>
+            <w:r>
+              <w:rPr>
+                <w:b/>
+              </w:rPr>
+              <w:t>Sumber</w:t>
+            </w:r>
+          </w:p>
+        </w:tc>
+        <w:tc>
+          <w:tcPr>
+            <w:tcW w:type="dxa" w:w="2160"/>
+          </w:tcPr>
+          <w:p>
+            <w:r>
+              <w:rPr>
+                <w:b/>
+              </w:rPr>
+              <w:t>Status di Dataset</w:t>
+            </w:r>
+          </w:p>
+        </w:tc>
+      </w:tr>
+      <w:tr>
+        <w:tc>
+          <w:tcPr>
+            <w:tcW w:type="dxa" w:w="2160"/>
+          </w:tcPr>
+          <w:p>
+            <w:r>
+              <w:t>pH</w:t>
+            </w:r>
+          </w:p>
+        </w:tc>
+        <w:tc>
+          <w:tcPr>
+            <w:tcW w:type="dxa" w:w="2160"/>
+          </w:tcPr>
+          <w:p>
+            <w:r>
+              <w:t>6.5-8.5</w:t>
+            </w:r>
+          </w:p>
+        </w:tc>
+        <w:tc>
+          <w:tcPr>
+            <w:tcW w:type="dxa" w:w="2160"/>
+          </w:tcPr>
+          <w:p>
+            <w:r>
+              <w:t>Tabel 1 No.8</w:t>
+            </w:r>
+          </w:p>
+        </w:tc>
+        <w:tc>
+          <w:tcPr>
+            <w:tcW w:type="dxa" w:w="2160"/>
+          </w:tcPr>
+          <w:p>
+            <w:r>
+              <w:t>Banyak di luar range (0-14)</w:t>
+            </w:r>
+          </w:p>
+        </w:tc>
+      </w:tr>
+      <w:tr>
+        <w:tc>
+          <w:tcPr>
+            <w:tcW w:type="dxa" w:w="2160"/>
+          </w:tcPr>
+          <w:p>
+            <w:r>
+              <w:t>TDS</w:t>
+            </w:r>
+          </w:p>
+        </w:tc>
+        <w:tc>
+          <w:tcPr>
+            <w:tcW w:type="dxa" w:w="2160"/>
+          </w:tcPr>
+          <w:p>
+            <w:r>
+              <w:t>&lt;300 mg/L</w:t>
+            </w:r>
+          </w:p>
+        </w:tc>
+        <w:tc>
+          <w:tcPr>
+            <w:tcW w:type="dxa" w:w="2160"/>
+          </w:tcPr>
+          <w:p>
+            <w:r>
+              <w:t>Tabel 1 No.4</w:t>
+            </w:r>
+          </w:p>
+        </w:tc>
+        <w:tc>
+          <w:tcPr>
+            <w:tcW w:type="dxa" w:w="2160"/>
+          </w:tcPr>
+          <w:p>
+            <w:r>
+              <w:t>SELURUH data melebihi (min 321)</w:t>
+            </w:r>
+          </w:p>
+        </w:tc>
+      </w:tr>
+      <w:tr>
+        <w:tc>
+          <w:tcPr>
+            <w:tcW w:type="dxa" w:w="2160"/>
+          </w:tcPr>
+          <w:p>
+            <w:r>
+              <w:t>Kekeruhan/Turbidity</w:t>
+            </w:r>
+          </w:p>
+        </w:tc>
+        <w:tc>
+          <w:tcPr>
+            <w:tcW w:type="dxa" w:w="2160"/>
+          </w:tcPr>
+          <w:p>
+            <w:r>
+              <w:t>&lt;3 NTU</w:t>
+            </w:r>
+          </w:p>
+        </w:tc>
+        <w:tc>
+          <w:tcPr>
+            <w:tcW w:type="dxa" w:w="2160"/>
+          </w:tcPr>
+          <w:p>
+            <w:r>
+              <w:t>Tabel 1 No.5</w:t>
+            </w:r>
+          </w:p>
+        </w:tc>
+        <w:tc>
+          <w:tcPr>
+            <w:tcW w:type="dxa" w:w="2160"/>
+          </w:tcPr>
+          <w:p>
+            <w:r>
+              <w:t>Sebagian melebihi</w:t>
+            </w:r>
+          </w:p>
+        </w:tc>
+      </w:tr>
+      <w:tr>
+        <w:tc>
+          <w:tcPr>
+            <w:tcW w:type="dxa" w:w="2160"/>
+          </w:tcPr>
+          <w:p>
+            <w:r>
+              <w:t>Sisa Khlor/Chloramines</w:t>
+            </w:r>
+          </w:p>
+        </w:tc>
+        <w:tc>
+          <w:tcPr>
+            <w:tcW w:type="dxa" w:w="2160"/>
+          </w:tcPr>
+          <w:p>
+            <w:r>
+              <w:t>0.2-0.5 mg/L</w:t>
+            </w:r>
+          </w:p>
+        </w:tc>
+        <w:tc>
+          <w:tcPr>
+            <w:tcW w:type="dxa" w:w="2160"/>
+          </w:tcPr>
+          <w:p>
+            <w:r>
+              <w:t>Tabel 1 No.14</w:t>
+            </w:r>
+          </w:p>
+        </w:tc>
+        <w:tc>
+          <w:tcPr>
+            <w:tcW w:type="dxa" w:w="2160"/>
+          </w:tcPr>
+          <w:p>
+            <w:r>
+              <w:t>Hampir semua melebihi</w:t>
+            </w:r>
+          </w:p>
+        </w:tc>
+      </w:tr>
+      <w:tr>
+        <w:tc>
+          <w:tcPr>
+            <w:tcW w:type="dxa" w:w="2160"/>
+          </w:tcPr>
+          <w:p>
+            <w:r>
+              <w:t>Hardness</w:t>
+            </w:r>
+          </w:p>
+        </w:tc>
+        <w:tc>
+          <w:tcPr>
+            <w:tcW w:type="dxa" w:w="2160"/>
+          </w:tcPr>
+          <w:p>
+            <w:r>
+              <w:t>TIDAK ADA</w:t>
+            </w:r>
+          </w:p>
+        </w:tc>
+        <w:tc>
+          <w:tcPr>
+            <w:tcW w:type="dxa" w:w="2160"/>
+          </w:tcPr>
+          <w:p>
+            <w:r>
+              <w:t>Tidak di Tabel Wajib</w:t>
+            </w:r>
+          </w:p>
+        </w:tc>
+        <w:tc>
+          <w:tcPr>
+            <w:tcW w:type="dxa" w:w="2160"/>
+          </w:tcPr>
+          <w:p>
+            <w:r>
+              <w:t>Gunakan WHO</w:t>
+            </w:r>
+          </w:p>
+        </w:tc>
+      </w:tr>
+      <w:tr>
+        <w:tc>
+          <w:tcPr>
+            <w:tcW w:type="dxa" w:w="2160"/>
+          </w:tcPr>
+          <w:p>
+            <w:r>
+              <w:t>Sulfate</w:t>
+            </w:r>
+          </w:p>
+        </w:tc>
+        <w:tc>
+          <w:tcPr>
+            <w:tcW w:type="dxa" w:w="2160"/>
+          </w:tcPr>
+          <w:p>
+            <w:r>
+              <w:t>TIDAK ADA</w:t>
+            </w:r>
+          </w:p>
+        </w:tc>
+        <w:tc>
+          <w:tcPr>
+            <w:tcW w:type="dxa" w:w="2160"/>
+          </w:tcPr>
+          <w:p>
+            <w:r>
+              <w:t>Tidak di Tabel Wajib</w:t>
+            </w:r>
+          </w:p>
+        </w:tc>
+        <w:tc>
+          <w:tcPr>
+            <w:tcW w:type="dxa" w:w="2160"/>
+          </w:tcPr>
+          <w:p>
+            <w:r>
+              <w:t>Gunakan WHO</w:t>
+            </w:r>
+          </w:p>
+        </w:tc>
+      </w:tr>
+      <w:tr>
+        <w:tc>
+          <w:tcPr>
+            <w:tcW w:type="dxa" w:w="2160"/>
+          </w:tcPr>
+          <w:p>
+            <w:r>
+              <w:t>Conductivity</w:t>
+            </w:r>
+          </w:p>
+        </w:tc>
+        <w:tc>
+          <w:tcPr>
+            <w:tcW w:type="dxa" w:w="2160"/>
+          </w:tcPr>
+          <w:p>
+            <w:r>
+              <w:t>TIDAK ADA</w:t>
+            </w:r>
+          </w:p>
+        </w:tc>
+        <w:tc>
+          <w:tcPr>
+            <w:tcW w:type="dxa" w:w="2160"/>
+          </w:tcPr>
+          <w:p>
+            <w:r>
+              <w:t>Tidak di Tabel Wajib/Khusus</w:t>
+            </w:r>
+          </w:p>
+        </w:tc>
+        <w:tc>
+          <w:tcPr>
+            <w:tcW w:type="dxa" w:w="2160"/>
+          </w:tcPr>
+          <w:p>
+            <w:r>
+              <w:t>Gunakan WHO/data-driven</w:t>
+            </w:r>
+          </w:p>
+        </w:tc>
+      </w:tr>
+      <w:tr>
+        <w:tc>
+          <w:tcPr>
+            <w:tcW w:type="dxa" w:w="2160"/>
+          </w:tcPr>
+          <w:p>
+            <w:r>
+              <w:t>Organic Carbon</w:t>
+            </w:r>
+          </w:p>
+        </w:tc>
+        <w:tc>
+          <w:tcPr>
+            <w:tcW w:type="dxa" w:w="2160"/>
+          </w:tcPr>
+          <w:p>
+            <w:r>
+              <w:t>TIDAK ADA*</w:t>
+            </w:r>
+          </w:p>
+        </w:tc>
+        <w:tc>
+          <w:tcPr>
+            <w:tcW w:type="dxa" w:w="2160"/>
+          </w:tcPr>
+          <w:p>
+            <w:r>
+              <w:t>*Tabel 2: Hidrokarbon poliaromatik 0.0007 (beda konteks)</w:t>
+            </w:r>
+          </w:p>
+        </w:tc>
+        <w:tc>
+          <w:tcPr>
+            <w:tcW w:type="dxa" w:w="2160"/>
+          </w:tcPr>
+          <w:p>
+            <w:r>
+              <w:t>Gunakan WHO/data-driven</w:t>
+            </w:r>
+          </w:p>
+        </w:tc>
+      </w:tr>
+      <w:tr>
+        <w:tc>
+          <w:tcPr>
+            <w:tcW w:type="dxa" w:w="2160"/>
+          </w:tcPr>
+          <w:p>
+            <w:r>
+              <w:t>Trihalomethanes</w:t>
+            </w:r>
+          </w:p>
+        </w:tc>
+        <w:tc>
+          <w:tcPr>
+            <w:tcW w:type="dxa" w:w="2160"/>
+          </w:tcPr>
+          <w:p>
+            <w:r>
+              <w:t>TIDAK ADA</w:t>
+            </w:r>
+          </w:p>
+        </w:tc>
+        <w:tc>
+          <w:tcPr>
+            <w:tcW w:type="dxa" w:w="2160"/>
+          </w:tcPr>
+          <w:p>
+            <w:r>
+              <w:t>Tidak di Tabel Wajib/Khusus</w:t>
+            </w:r>
+          </w:p>
+        </w:tc>
+        <w:tc>
+          <w:tcPr>
+            <w:tcW w:type="dxa" w:w="2160"/>
+          </w:tcPr>
+          <w:p>
+            <w:r>
+              <w:t>Gunakan WHO</w:t>
+            </w:r>
+          </w:p>
+        </w:tc>
+      </w:tr>
+    </w:tbl>
+    <w:p/>
+    <w:p>
+      <w:r>
+        <w:t>NARASI 2 SKENARIO (tambahkan di sub-bab 3.5.2):</w:t>
+        <w:br/>
+        <w:t>Evaluasi feasibility dilakukan dengan 2 skenario:</w:t>
+        <w:br/>
+        <w:t>Skenario 1 (Generation): DiCE membangkitkan counterfactual dengan constraint berdasarkan WHO Guidelines for Drinking-Water Quality (2022) yang memiliki range lebih permissive dan sesuai dengan distribusi data benchmark.</w:t>
+        <w:br/>
+        <w:t>Skenario 2 (Evaluasi Regulasi): Counterfactual yang dihasilkan kemudian dievaluasi terhadap standar Permenkes No. 2/2023 untuk mengukur seberapa compliant rekomendasi terhadap regulasi Indonesia.</w:t>
+        <w:br/>
+        <w:t>Analisis gap antara feasibility Skenario 1 dan Skenario 2 menghasilkan insight tentang kesesuaian distribusi dataset benchmark terhadap standar regulasi Indonesia. Jika feasibility Skenario 2 jauh lebih rendah, ini mengindikasikan bahwa kerangka kerja akan lebih optimal jika diaplikasikan pada data aktual yang distribusinya mendekati standar Permenkes.</w:t>
       </w:r>
     </w:p>
     <w:p>
@@ -6002,7 +6482,7 @@
     </w:p>
     <w:p>
       <w:r>
-        <w:t>Menurut WHO (2022), sekitar 2 miliar orang di seluruh dunia masih menggunakan sumber air minum yang terkontaminasi. Di Indonesia, data Badan Pusat Statistik (2023) menunjukkan bahwa akses terhadap air minum layak belum merata di seluruh wilayah, dengan disparitas signifikan antara perkotaan dan perdesaan. Kondisi ini menegaskan kebutuhan akan sistem monitoring dan evaluasi kualitas air yang tidak hanya akurat dalam memprediksi kelayakan, tetapi juga mampu memberikan rekomendasi perbaikan yang spesifik dan dapat ditindaklanjuti oleh operator pengolahan air.</w:t>
+        <w:t>Menurut laporan WHO, UNICEF, dan World Bank (2022), meskipun 74% populasi dunia (5,8 miliar orang) telah mengakses air minum yang dikelola secara aman pada tahun 2020, masih terdapat 2 miliar orang yang belum memiliki akses terhadap layanan air minum yang aman [NEW_REF_WHO_SOWD]. Di Indonesia, tantangan serupa dihadapi oleh Perusahaan Daerah Air Minum (PDAM) yang mengalami keterbatasan infrastruktur sehingga hanya mampu melayani sebagian kecil rumah tangga di wilayah layanannya [NEW_REF_WHO_SOWD, hal. 92]. Kondisi ini menegaskan kebutuhan akan sistem evaluasi kualitas air yang tidak hanya akurat dalam memprediksi kelayakan, tetapi juga mampu memberikan rekomendasi perbaikan yang spesifik dan dapat ditindaklanjuti oleh operator pengolahan air.</w:t>
       </w:r>
     </w:p>
     <w:p/>
@@ -6014,22 +6494,7 @@
         <w:t>CATATAN PENTING:</w:t>
       </w:r>
       <w:r>
-        <w:t xml:space="preserve"> Verifikasi angka dan tahun dari sumber resmi:</w:t>
-      </w:r>
-    </w:p>
-    <w:p>
-      <w:r>
-        <w:t>- WHO: "Drinking-water Key Facts" (2022/2023) - https://www.who.int/news-room/fact-sheets/detail/drinking-water</w:t>
-      </w:r>
-    </w:p>
-    <w:p>
-      <w:r>
-        <w:t>- BPS: "Statistik Lingkungan Hidup Indonesia" atau "Indikator Perumahan dan Kesehatan Lingkungan" edisi terbaru</w:t>
-      </w:r>
-    </w:p>
-    <w:p>
-      <w:r>
-        <w:t>- Pastikan sitasi sesuai format IEEE yang digunakan di proposal</w:t>
+        <w:t xml:space="preserve"> Data di atas berasal dari WHO, UNICEF, World Bank, "State of the World's Drinking Water," 2022, ISBN 978-92-4-006080-7 (hal. 11 Executive Summary dan hal. 92 Box 29). Tidak perlu data BPS.</w:t>
       </w:r>
     </w:p>
     <w:p>
@@ -6831,6 +7296,29 @@
         <w:pStyle w:val="Heading3"/>
       </w:pPr>
       <w:r>
+        <w:t>Pertanyaan Constraint 2 Skenario</w:t>
+      </w:r>
+    </w:p>
+    <w:p>
+      <w:r>
+        <w:t>L1: "Constraint generation pakai WHO (lebih loose, sesuai distribusi data), evaluasi feasibility pakai Permenkes (lebih ketat)."</w:t>
+      </w:r>
+    </w:p>
+    <w:p>
+      <w:r>
+        <w:t>L2: "Hanya 4 dari 9 parameter ada di Permenkes Tabel Wajib (pH, TDS, Turbidity, Sisa Khlor). Sisanya tidak ada - harus pakai WHO."</w:t>
+      </w:r>
+    </w:p>
+    <w:p>
+      <w:r>
+        <w:t>L3: "Feasibility rendah terhadap Permenkes = TEMUAN PENELITIAN bahwa dataset benchmark tidak representatif terhadap standar Indonesia. Kerangka akan optimal pada data PDAM yang lebih realistis."</w:t>
+      </w:r>
+    </w:p>
+    <w:p>
+      <w:pPr>
+        <w:pStyle w:val="Heading3"/>
+      </w:pPr>
+      <w:r>
         <w:t>Pertanyaan Populasi/Sampel/Instrumen</w:t>
       </w:r>
     </w:p>
@@ -6928,6 +7416,91 @@
         <w:pStyle w:val="Heading2"/>
       </w:pPr>
       <w:r>
+        <w:t>KONSOLIDASI REFERENSI FINAL</w:t>
+      </w:r>
+    </w:p>
+    <w:p>
+      <w:r>
+        <w:rPr>
+          <w:b/>
+        </w:rPr>
+        <w:t>REFERENSI YANG DITAMBAHKAN:</w:t>
+      </w:r>
+    </w:p>
+    <w:p>
+      <w:r>
+        <w:t>[NEW_5] M. Yurtsever and M. Emec, "Potable Water Quality Prediction Using AI and ML Algorithms for Better Sustainability," Ege Academic Review, vol. 23, no. 2, pp. 265-278, 2023, doi: 10.21121/eab.1252167.</w:t>
+      </w:r>
+    </w:p>
+    <w:p>
+      <w:r>
+        <w:t>[NEW_PATEL] (nomor sesuai urutan) - S. Patel et al., Computational Intelligence and Neuroscience, 2022, doi: 10.1155/2022/9283293.</w:t>
+      </w:r>
+    </w:p>
+    <w:p>
+      <w:r>
+        <w:t>[NEW_WHO_SOWD] WHO, UNICEF, World Bank, "State of the World's Drinking Water," 2022, ISBN 978-92-4-006080-7.</w:t>
+      </w:r>
+    </w:p>
+    <w:p>
+      <w:r>
+        <w:t>[NEW_WHO_GDW] WHO, "Guidelines for Drinking-Water Quality," 4th ed., 2022, ISBN 978-92-4-004506-4.</w:t>
+      </w:r>
+    </w:p>
+    <w:p>
+      <w:r>
+        <w:t>[NEW_PERMENKES] Kementerian Kesehatan RI, "Permenkes No. 2 Tahun 2023 tentang Peraturan Pelaksanaan PP No. 66 Tahun 2014 tentang Kesehatan Lingkungan," Berita Negara RI No. 55, 2023.</w:t>
+      </w:r>
+    </w:p>
+    <w:p/>
+    <w:p>
+      <w:r>
+        <w:rPr>
+          <w:b/>
+        </w:rPr>
+        <w:t>REFERENSI YANG DIHAPUS:</w:t>
+      </w:r>
+    </w:p>
+    <w:p>
+      <w:r>
+        <w:t>[5] Li et al. (2026) soil moisture -&gt; DIGANTI dengan Yurtsever &amp; Emec (2023) sebagai [5] baru</w:t>
+      </w:r>
+    </w:p>
+    <w:p/>
+    <w:p>
+      <w:r>
+        <w:rPr>
+          <w:b/>
+        </w:rPr>
+        <w:t>REFERENSI YANG DIPERTAHANKAN:</w:t>
+      </w:r>
+    </w:p>
+    <w:p>
+      <w:r>
+        <w:t>[2] Al Bataineh et al. (2026) -&gt; TETAP (terverifikasi IEEE JSTARS Vol.19). Metrik: Acc 86.9%, F1 0.849, AUC 0.894</w:t>
+      </w:r>
+    </w:p>
+    <w:p>
+      <w:r>
+        <w:t>[16] Duan et al. (2020) NGBoost -&gt; TETAP sebagai ref utama NGBoost</w:t>
+      </w:r>
+    </w:p>
+    <w:p/>
+    <w:p>
+      <w:r>
+        <w:t>CATATAN: Semua referensi [NEW_xxx] harus diberi nomor urut yang sesuai saat dimasukkan ke daftar pustaka proposal. Penomoran mengikuti urutan kemunculan pertama dalam teks.</w:t>
+      </w:r>
+    </w:p>
+    <w:p>
+      <w:r>
+        <w:br w:type="page"/>
+      </w:r>
+    </w:p>
+    <w:p>
+      <w:pPr>
+        <w:pStyle w:val="Heading2"/>
+      </w:pPr>
+      <w:r>
         <w:t>CHECKLIST REVISI (28 Item)</w:t>
       </w:r>
     </w:p>
@@ -8781,7 +9354,7 @@
         <w:pStyle w:val="Heading2"/>
       </w:pPr>
       <w:r>
-        <w:t>CATATAN PENTING (12 item)</w:t>
+        <w:t>CATATAN PENTING (13 item)</w:t>
       </w:r>
     </w:p>
     <w:p>
@@ -8842,6 +9415,11 @@
     <w:p>
       <w:r>
         <w:t>12. Justifikasi metode (NGBoost, DiCE) harus EKSPLISIT di BAB 2 - jangan hanya deskripsi teori tanpa alasan pemilihan. Siapkan jawaban 3 level untuk pertanyaan "kenapa metode ini?"</w:t>
+      </w:r>
+    </w:p>
+    <w:p>
+      <w:r>
+        <w:t>13. Constraint Permenkes HANYA mencakup 4 parameter (pH, TDS, Turbidity, Sisa Khlor). 5 parameter lainnya TIDAK ADA di Permenkes Tabel Wajib - gunakan WHO Guidelines.</w:t>
       </w:r>
     </w:p>
     <w:sectPr>

</xml_diff>